<commit_message>
Drills + Sensitivity + Memo Templates + Study Guide Enhancements
DRILL FILES (6):
- Blanked key formulas: Revenue, EBITDA, CFADS, IRR, MOIC, Debt Schedule
- Added "DRILL MODE" note at row 2
- Formula Logic Column preserved as hints

MODEL FILES (6):
- Added Unlevered IRR row with formula
- Added sensitivity rule-of-thumb note (M3-M5)
- Trimmed Formula Logic to concise 4-line format

IC MEMO FILES (6):
- Converted to fill-in-the-blank templates
- Added asset-specific consideration prompts
- Created markdown versions for reference

STUDY GUIDE:
- Added Section 11: Advanced Scenarios
  - Preferred Equity / Mezz
  - Time Series Pricing
  - Construction Period
  - ERCOT (Texas) Modeling
  - Partnership Flip / Tax Equity
- Added Section 12: Proxy Defaults
  - Thermal, Renewables, Market Prices
  - Financing Defaults, Transaction Defaults

VERIFICATION:
- All Model files have working formulas (not blanked)
- All prior fixes intact
- ZIP verified by extraction (23 files)
</commit_message>
<xml_diff>
--- a/deliverables/deliverables-20260120-0030/IC_Memo_1_CCGT.docx
+++ b/deliverables/deliverables-20260120-0030/IC_Memo_1_CCGT.docx
@@ -3,28 +3,49 @@
 <w:document xmlns:wpc="http://schemas.microsoft.com/office/word/2010/wordprocessingCanvas" xmlns:mo="http://schemas.microsoft.com/office/mac/office/2008/main" xmlns:mc="http://schemas.openxmlformats.org/markup-compatibility/2006" xmlns:mv="urn:schemas-microsoft-com:mac:vml" xmlns:o="urn:schemas-microsoft-com:office:office" xmlns:r="http://schemas.openxmlformats.org/officeDocument/2006/relationships" xmlns:m="http://schemas.openxmlformats.org/officeDocument/2006/math" xmlns:v="urn:schemas-microsoft-com:vml" xmlns:wp14="http://schemas.microsoft.com/office/word/2010/wordprocessingDrawing" xmlns:wp="http://schemas.openxmlformats.org/drawingml/2006/wordprocessingDrawing" xmlns:w10="urn:schemas-microsoft-com:office:word" xmlns:w="http://schemas.openxmlformats.org/wordprocessingml/2006/main" xmlns:w14="http://schemas.microsoft.com/office/word/2010/wordml" xmlns:wpg="http://schemas.microsoft.com/office/word/2010/wordprocessingGroup" xmlns:wpi="http://schemas.microsoft.com/office/word/2010/wordprocessingInk" xmlns:wne="http://schemas.microsoft.com/office/word/2006/wordml" xmlns:wps="http://schemas.microsoft.com/office/word/2010/wordprocessingShape" mc:Ignorable="w14 wp14">
   <w:body>
     <w:p>
-      <w:pPr>
-        <w:pStyle w:val="Title"/>
-        <w:jc w:val="center"/>
-      </w:pPr>
-      <w:r>
-        <w:t>PROJECT SPARTAN</w:t>
-      </w:r>
-    </w:p>
-    <w:p>
-      <w:pPr>
-        <w:jc w:val="center"/>
-      </w:pPr>
       <w:r>
         <w:rPr>
-          <w:b/>
+          <w:sz w:val="20"/>
         </w:rPr>
-        <w:t>INVESTMENT COMMITTEE MEMORANDUM</w:t>
+        <w:t>═══════════════════════════════════════════════════════════════════</w:t>
       </w:r>
     </w:p>
     <w:p>
       <w:r>
-        <w:t>365 MW Combined Cycle Gas Turbine – PJM West</w:t>
+        <w:rPr>
+          <w:b/>
+          <w:sz w:val="24"/>
+        </w:rPr>
+        <w:t>LOTUS INFRASTRUCTURE PARTNERS</w:t>
+      </w:r>
+    </w:p>
+    <w:p>
+      <w:r>
+        <w:t>INVESTMENT COMMITTEE MEMORANDUM</w:t>
+      </w:r>
+    </w:p>
+    <w:p/>
+    <w:p>
+      <w:r>
+        <w:t>Asset: [CCGT Plant Name]</w:t>
+      </w:r>
+    </w:p>
+    <w:p>
+      <w:r>
+        <w:t>Date: ____________</w:t>
+      </w:r>
+    </w:p>
+    <w:p>
+      <w:r>
+        <w:t>Prepared By: ____________</w:t>
+      </w:r>
+    </w:p>
+    <w:p>
+      <w:r>
+        <w:rPr>
+          <w:sz w:val="20"/>
+        </w:rPr>
+        <w:t>═══════════════════════════════════════════════════════════════════</w:t>
       </w:r>
     </w:p>
     <w:p/>
@@ -32,1021 +53,456 @@
       <w:r>
         <w:rPr>
           <w:b/>
+          <w:sz w:val="24"/>
         </w:rPr>
-        <w:t xml:space="preserve">RECOMMENDATION: </w:t>
-      </w:r>
-      <w:r>
-        <w:t>Proceed to final bid at $520mm</w:t>
+        <w:t>EXECUTIVE SUMMARY</w:t>
       </w:r>
     </w:p>
     <w:p>
       <w:r>
-        <w:t>────────────────────────────────────────────────────────────</w:t>
-      </w:r>
-    </w:p>
-    <w:p>
-      <w:pPr>
-        <w:pStyle w:val="Heading2"/>
-      </w:pPr>
-      <w:r>
-        <w:t>KEY METRICS</w:t>
-      </w:r>
-    </w:p>
-    <w:tbl>
-      <w:tblPr>
-        <w:tblStyle w:val="TableGrid"/>
-        <w:tblW w:type="auto" w:w="0"/>
-        <w:tblLook w:firstColumn="1" w:firstRow="1" w:lastColumn="0" w:lastRow="0" w:noHBand="0" w:noVBand="1" w:val="04A0"/>
-      </w:tblPr>
-      <w:tblGrid>
-        <w:gridCol w:w="2160"/>
-        <w:gridCol w:w="2160"/>
-        <w:gridCol w:w="2160"/>
-        <w:gridCol w:w="2160"/>
-      </w:tblGrid>
-      <w:tr>
-        <w:tc>
-          <w:tcPr>
-            <w:tcW w:type="dxa" w:w="2160"/>
-            <w:shd w:fill="1F4E79"/>
-          </w:tcPr>
-          <w:p>
-            <w:r>
-              <w:rPr>
-                <w:b/>
-              </w:rPr>
-              <w:t>Metric</w:t>
-            </w:r>
-          </w:p>
-        </w:tc>
-        <w:tc>
-          <w:tcPr>
-            <w:tcW w:type="dxa" w:w="2160"/>
-            <w:shd w:fill="1F4E79"/>
-          </w:tcPr>
-          <w:p>
-            <w:r>
-              <w:rPr>
-                <w:b/>
-              </w:rPr>
-              <w:t>Base Case</w:t>
-            </w:r>
-          </w:p>
-        </w:tc>
-        <w:tc>
-          <w:tcPr>
-            <w:tcW w:type="dxa" w:w="2160"/>
-            <w:shd w:fill="1F4E79"/>
-          </w:tcPr>
-          <w:p>
-            <w:r>
-              <w:rPr>
-                <w:b/>
-              </w:rPr>
-              <w:t>Downside</w:t>
-            </w:r>
-          </w:p>
-        </w:tc>
-        <w:tc>
-          <w:tcPr>
-            <w:tcW w:type="dxa" w:w="2160"/>
-            <w:shd w:fill="1F4E79"/>
-          </w:tcPr>
-          <w:p>
-            <w:r>
-              <w:rPr>
-                <w:b/>
-              </w:rPr>
-              <w:t>Upside</w:t>
-            </w:r>
-          </w:p>
-        </w:tc>
-      </w:tr>
-      <w:tr>
-        <w:tc>
-          <w:tcPr>
-            <w:tcW w:type="dxa" w:w="2160"/>
-          </w:tcPr>
-          <w:p>
-            <w:r>
-              <w:t>Entry EV</w:t>
-            </w:r>
-          </w:p>
-        </w:tc>
-        <w:tc>
-          <w:tcPr>
-            <w:tcW w:type="dxa" w:w="2160"/>
-          </w:tcPr>
-          <w:p>
-            <w:r>
-              <w:t>$520mm</w:t>
-            </w:r>
-          </w:p>
-        </w:tc>
-        <w:tc>
-          <w:tcPr>
-            <w:tcW w:type="dxa" w:w="2160"/>
-          </w:tcPr>
-          <w:p>
-            <w:r>
-              <w:t>-</w:t>
-            </w:r>
-          </w:p>
-        </w:tc>
-        <w:tc>
-          <w:tcPr>
-            <w:tcW w:type="dxa" w:w="2160"/>
-          </w:tcPr>
-          <w:p>
-            <w:r>
-              <w:t>-</w:t>
-            </w:r>
-          </w:p>
-        </w:tc>
-      </w:tr>
-      <w:tr>
-        <w:tc>
-          <w:tcPr>
-            <w:tcW w:type="dxa" w:w="2160"/>
-          </w:tcPr>
-          <w:p>
-            <w:r>
-              <w:t>Entry Multiple</w:t>
-            </w:r>
-          </w:p>
-        </w:tc>
-        <w:tc>
-          <w:tcPr>
-            <w:tcW w:type="dxa" w:w="2160"/>
-          </w:tcPr>
-          <w:p>
-            <w:r>
-              <w:t>7.8x Y1 EBITDA</w:t>
-            </w:r>
-          </w:p>
-        </w:tc>
-        <w:tc>
-          <w:tcPr>
-            <w:tcW w:type="dxa" w:w="2160"/>
-          </w:tcPr>
-          <w:p>
-            <w:r>
-              <w:t>-</w:t>
-            </w:r>
-          </w:p>
-        </w:tc>
-        <w:tc>
-          <w:tcPr>
-            <w:tcW w:type="dxa" w:w="2160"/>
-          </w:tcPr>
-          <w:p>
-            <w:r>
-              <w:t>-</w:t>
-            </w:r>
-          </w:p>
-        </w:tc>
-      </w:tr>
-      <w:tr>
-        <w:tc>
-          <w:tcPr>
-            <w:tcW w:type="dxa" w:w="2160"/>
-          </w:tcPr>
-          <w:p>
-            <w:r>
-              <w:t>Leverage</w:t>
-            </w:r>
-          </w:p>
-        </w:tc>
-        <w:tc>
-          <w:tcPr>
-            <w:tcW w:type="dxa" w:w="2160"/>
-          </w:tcPr>
-          <w:p>
-            <w:r>
-              <w:t>45%</w:t>
-            </w:r>
-          </w:p>
-        </w:tc>
-        <w:tc>
-          <w:tcPr>
-            <w:tcW w:type="dxa" w:w="2160"/>
-          </w:tcPr>
-          <w:p>
-            <w:r>
-              <w:t>-</w:t>
-            </w:r>
-          </w:p>
-        </w:tc>
-        <w:tc>
-          <w:tcPr>
-            <w:tcW w:type="dxa" w:w="2160"/>
-          </w:tcPr>
-          <w:p>
-            <w:r>
-              <w:t>-</w:t>
-            </w:r>
-          </w:p>
-        </w:tc>
-      </w:tr>
-      <w:tr>
-        <w:tc>
-          <w:tcPr>
-            <w:tcW w:type="dxa" w:w="2160"/>
-          </w:tcPr>
-          <w:p>
-            <w:r>
-              <w:t>Levered IRR</w:t>
-            </w:r>
-          </w:p>
-        </w:tc>
-        <w:tc>
-          <w:tcPr>
-            <w:tcW w:type="dxa" w:w="2160"/>
-          </w:tcPr>
-          <w:p>
-            <w:r>
-              <w:t>18.5%</w:t>
-            </w:r>
-          </w:p>
-        </w:tc>
-        <w:tc>
-          <w:tcPr>
-            <w:tcW w:type="dxa" w:w="2160"/>
-          </w:tcPr>
-          <w:p>
-            <w:r>
-              <w:t>14.2%</w:t>
-            </w:r>
-          </w:p>
-        </w:tc>
-        <w:tc>
-          <w:tcPr>
-            <w:tcW w:type="dxa" w:w="2160"/>
-          </w:tcPr>
-          <w:p>
-            <w:r>
-              <w:t>22.8%</w:t>
-            </w:r>
-          </w:p>
-        </w:tc>
-      </w:tr>
-      <w:tr>
-        <w:tc>
-          <w:tcPr>
-            <w:tcW w:type="dxa" w:w="2160"/>
-          </w:tcPr>
-          <w:p>
-            <w:r>
-              <w:t>MOIC</w:t>
-            </w:r>
-          </w:p>
-        </w:tc>
-        <w:tc>
-          <w:tcPr>
-            <w:tcW w:type="dxa" w:w="2160"/>
-          </w:tcPr>
-          <w:p>
-            <w:r>
-              <w:t>2.15x</w:t>
-            </w:r>
-          </w:p>
-        </w:tc>
-        <w:tc>
-          <w:tcPr>
-            <w:tcW w:type="dxa" w:w="2160"/>
-          </w:tcPr>
-          <w:p>
-            <w:r>
-              <w:t>1.85x</w:t>
-            </w:r>
-          </w:p>
-        </w:tc>
-        <w:tc>
-          <w:tcPr>
-            <w:tcW w:type="dxa" w:w="2160"/>
-          </w:tcPr>
-          <w:p>
-            <w:r>
-              <w:t>2.45x</w:t>
-            </w:r>
-          </w:p>
-        </w:tc>
-      </w:tr>
-      <w:tr>
-        <w:tc>
-          <w:tcPr>
-            <w:tcW w:type="dxa" w:w="2160"/>
-          </w:tcPr>
-          <w:p>
-            <w:r>
-              <w:t>Min DSCR</w:t>
-            </w:r>
-          </w:p>
-        </w:tc>
-        <w:tc>
-          <w:tcPr>
-            <w:tcW w:type="dxa" w:w="2160"/>
-          </w:tcPr>
-          <w:p>
-            <w:r>
-              <w:t>1.42x</w:t>
-            </w:r>
-          </w:p>
-        </w:tc>
-        <w:tc>
-          <w:tcPr>
-            <w:tcW w:type="dxa" w:w="2160"/>
-          </w:tcPr>
-          <w:p>
-            <w:r>
-              <w:t>1.28x</w:t>
-            </w:r>
-          </w:p>
-        </w:tc>
-        <w:tc>
-          <w:tcPr>
-            <w:tcW w:type="dxa" w:w="2160"/>
-          </w:tcPr>
-          <w:p>
-            <w:r>
-              <w:t>1.58x</w:t>
-            </w:r>
-          </w:p>
-        </w:tc>
-      </w:tr>
-      <w:tr>
-        <w:tc>
-          <w:tcPr>
-            <w:tcW w:type="dxa" w:w="2160"/>
-          </w:tcPr>
-          <w:p>
-            <w:r>
-              <w:t>Unlevered IRR</w:t>
-            </w:r>
-          </w:p>
-        </w:tc>
-        <w:tc>
-          <w:tcPr>
-            <w:tcW w:type="dxa" w:w="2160"/>
-          </w:tcPr>
-          <w:p>
-            <w:r>
-              <w:t>12.1%</w:t>
-            </w:r>
-          </w:p>
-        </w:tc>
-        <w:tc>
-          <w:tcPr>
-            <w:tcW w:type="dxa" w:w="2160"/>
-          </w:tcPr>
-          <w:p>
-            <w:r>
-              <w:t>-</w:t>
-            </w:r>
-          </w:p>
-        </w:tc>
-        <w:tc>
-          <w:tcPr>
-            <w:tcW w:type="dxa" w:w="2160"/>
-          </w:tcPr>
-          <w:p>
-            <w:r>
-              <w:t>-</w:t>
-            </w:r>
-          </w:p>
-        </w:tc>
-      </w:tr>
-    </w:tbl>
-    <w:p/>
-    <w:p>
-      <w:r>
-        <w:t>────────────────────────────────────────────────────────────</w:t>
-      </w:r>
-    </w:p>
-    <w:p>
-      <w:pPr>
-        <w:pStyle w:val="Heading2"/>
-      </w:pPr>
-      <w:r>
-        <w:t>INVESTMENT THESIS</w:t>
-      </w:r>
-    </w:p>
-    <w:p>
-      <w:r>
-        <w:t>• Strategic PJM West location with dual revenue streams (energy + capacity) provides diversified cash flow profile</w:t>
-      </w:r>
-    </w:p>
-    <w:p>
-      <w:r>
-        <w:t>• Efficient 7,000 Btu/kWh heat rate positions asset competitively on dispatch stack, ensuring consistent energy margins</w:t>
-      </w:r>
-    </w:p>
-    <w:p>
-      <w:r>
-        <w:t>• Recent PJM capacity auction results support sustained capacity revenue outlook through the hold period</w:t>
-      </w:r>
-    </w:p>
-    <w:p>
-      <w:r>
-        <w:t>• Clear exit path to strategic buyers (utilities seeking gas generation) and infrastructure yield vehicles</w:t>
+        <w:rPr>
+          <w:sz w:val="20"/>
+        </w:rPr>
+        <w:t>─────────────────────────────────────────────────────────────────</w:t>
       </w:r>
     </w:p>
     <w:p/>
     <w:p>
       <w:r>
-        <w:t>────────────────────────────────────────────────────────────</w:t>
-      </w:r>
-    </w:p>
-    <w:p>
-      <w:pPr>
-        <w:pStyle w:val="Heading2"/>
-      </w:pPr>
-      <w:r>
-        <w:t>KEY RISKS &amp; MITIGANTS</w:t>
-      </w:r>
-    </w:p>
-    <w:tbl>
-      <w:tblPr>
-        <w:tblStyle w:val="TableGrid"/>
-        <w:tblW w:type="auto" w:w="0"/>
-        <w:tblLook w:firstColumn="1" w:firstRow="1" w:lastColumn="0" w:lastRow="0" w:noHBand="0" w:noVBand="1" w:val="04A0"/>
-      </w:tblPr>
-      <w:tblGrid>
-        <w:gridCol w:w="2880"/>
-        <w:gridCol w:w="2880"/>
-        <w:gridCol w:w="2880"/>
-      </w:tblGrid>
-      <w:tr>
-        <w:tc>
-          <w:tcPr>
-            <w:tcW w:type="dxa" w:w="2880"/>
-            <w:shd w:fill="1F4E79"/>
-          </w:tcPr>
-          <w:p>
-            <w:r>
-              <w:rPr>
-                <w:b/>
-              </w:rPr>
-              <w:t>Risk</w:t>
-            </w:r>
-          </w:p>
-        </w:tc>
-        <w:tc>
-          <w:tcPr>
-            <w:tcW w:type="dxa" w:w="2880"/>
-            <w:shd w:fill="1F4E79"/>
-          </w:tcPr>
-          <w:p>
-            <w:r>
-              <w:rPr>
-                <w:b/>
-              </w:rPr>
-              <w:t>Probability</w:t>
-            </w:r>
-          </w:p>
-        </w:tc>
-        <w:tc>
-          <w:tcPr>
-            <w:tcW w:type="dxa" w:w="2880"/>
-            <w:shd w:fill="1F4E79"/>
-          </w:tcPr>
-          <w:p>
-            <w:r>
-              <w:rPr>
-                <w:b/>
-              </w:rPr>
-              <w:t>Mitigant</w:t>
-            </w:r>
-          </w:p>
-        </w:tc>
-      </w:tr>
-      <w:tr>
-        <w:tc>
-          <w:tcPr>
-            <w:tcW w:type="dxa" w:w="2880"/>
-          </w:tcPr>
-          <w:p>
-            <w:r>
-              <w:t>Gas price volatility</w:t>
-            </w:r>
-          </w:p>
-        </w:tc>
-        <w:tc>
-          <w:tcPr>
-            <w:tcW w:type="dxa" w:w="2880"/>
-          </w:tcPr>
-          <w:p>
-            <w:r>
-              <w:t>Medium</w:t>
-            </w:r>
-          </w:p>
-        </w:tc>
-        <w:tc>
-          <w:tcPr>
-            <w:tcW w:type="dxa" w:w="2880"/>
-          </w:tcPr>
-          <w:p>
-            <w:r>
-              <w:t>Partial hedge program (50% Y1-Y3); efficient heat rate provides margin cushion</w:t>
-            </w:r>
-          </w:p>
-        </w:tc>
-      </w:tr>
-      <w:tr>
-        <w:tc>
-          <w:tcPr>
-            <w:tcW w:type="dxa" w:w="2880"/>
-          </w:tcPr>
-          <w:p>
-            <w:r>
-              <w:t>Capacity price decline</w:t>
-            </w:r>
-          </w:p>
-        </w:tc>
-        <w:tc>
-          <w:tcPr>
-            <w:tcW w:type="dxa" w:w="2880"/>
-          </w:tcPr>
-          <w:p>
-            <w:r>
-              <w:t>Medium</w:t>
-            </w:r>
-          </w:p>
-        </w:tc>
-        <w:tc>
-          <w:tcPr>
-            <w:tcW w:type="dxa" w:w="2880"/>
-          </w:tcPr>
-          <w:p>
-            <w:r>
-              <w:t>PJM capacity construct provides 3-year forward visibility; locked through Y3</w:t>
-            </w:r>
-          </w:p>
-        </w:tc>
-      </w:tr>
-      <w:tr>
-        <w:tc>
-          <w:tcPr>
-            <w:tcW w:type="dxa" w:w="2880"/>
-          </w:tcPr>
-          <w:p>
-            <w:r>
-              <w:t>Forced outage risk</w:t>
-            </w:r>
-          </w:p>
-        </w:tc>
-        <w:tc>
-          <w:tcPr>
-            <w:tcW w:type="dxa" w:w="2880"/>
-          </w:tcPr>
-          <w:p>
-            <w:r>
-              <w:t>Low</w:t>
-            </w:r>
-          </w:p>
-        </w:tc>
-        <w:tc>
-          <w:tcPr>
-            <w:tcW w:type="dxa" w:w="2880"/>
-          </w:tcPr>
-          <w:p>
-            <w:r>
-              <w:t>Comprehensive LTSA with OEM; historical 95% availability; 6-month DSRA</w:t>
-            </w:r>
-          </w:p>
-        </w:tc>
-      </w:tr>
-      <w:tr>
-        <w:tc>
-          <w:tcPr>
-            <w:tcW w:type="dxa" w:w="2880"/>
-          </w:tcPr>
-          <w:p>
-            <w:r>
-              <w:t>Environmental regulation</w:t>
-            </w:r>
-          </w:p>
-        </w:tc>
-        <w:tc>
-          <w:tcPr>
-            <w:tcW w:type="dxa" w:w="2880"/>
-          </w:tcPr>
-          <w:p>
-            <w:r>
-              <w:t>Medium</w:t>
-            </w:r>
-          </w:p>
-        </w:tc>
-        <w:tc>
-          <w:tcPr>
-            <w:tcW w:type="dxa" w:w="2880"/>
-          </w:tcPr>
-          <w:p>
-            <w:r>
-              <w:t>No pending EPA action on unit; brownfield expansion rights provide optionality</w:t>
-            </w:r>
-          </w:p>
-        </w:tc>
-      </w:tr>
-    </w:tbl>
-    <w:p/>
-    <w:p>
-      <w:r>
-        <w:t>────────────────────────────────────────────────────────────</w:t>
-      </w:r>
-    </w:p>
-    <w:p>
-      <w:pPr>
-        <w:pStyle w:val="Heading2"/>
-      </w:pPr>
-      <w:r>
-        <w:t>FINANCING STRUCTURE RATIONALE</w:t>
+        <w:t>Transaction:     Acquisition of ___MW CCGT in [ISO/Region]</w:t>
       </w:r>
     </w:p>
     <w:p>
       <w:r>
-        <w:t>Structure: 7-year term loan with 75% cash sweep and 6-month DSRA</w:t>
+        <w:t>Entry EV:        $______mm</w:t>
+      </w:r>
+    </w:p>
+    <w:p>
+      <w:r>
+        <w:t>Capital Structure: ____% Debt / ____% Equity</w:t>
+      </w:r>
+    </w:p>
+    <w:p>
+      <w:r>
+        <w:t>Levered IRR:     ____%</w:t>
+      </w:r>
+    </w:p>
+    <w:p>
+      <w:r>
+        <w:t>MOIC:            ____x</w:t>
+      </w:r>
+    </w:p>
+    <w:p>
+      <w:r>
+        <w:t>Recommendation:  [ ] INVEST  [ ] PASS  [ ] CONDITIONAL</w:t>
       </w:r>
     </w:p>
     <w:p/>
     <w:p>
       <w:r>
-        <w:t>Rationale:</w:t>
-      </w:r>
-    </w:p>
-    <w:p>
-      <w:r>
-        <w:t>• Cash sweep structure appropriate for merchant asset with variable CFADS – accelerates paydown in strong years</w:t>
-      </w:r>
-    </w:p>
-    <w:p>
-      <w:r>
-        <w:t>• 45% leverage balances return enhancement with covenant headroom for commodity cycles</w:t>
-      </w:r>
-    </w:p>
-    <w:p>
-      <w:r>
-        <w:t>• 6-month DSRA provides liquidity buffer, sizing is market standard for merchant power</w:t>
-      </w:r>
-    </w:p>
-    <w:p>
-      <w:r>
-        <w:t>• Lock-up DSCR at 1.10x protects lenders while allowing distributions in base case</w:t>
-      </w:r>
-    </w:p>
-    <w:p/>
-    <w:p>
-      <w:r>
-        <w:t>────────────────────────────────────────────────────────────</w:t>
-      </w:r>
-    </w:p>
-    <w:p>
-      <w:pPr>
-        <w:pStyle w:val="Heading2"/>
-      </w:pPr>
-      <w:r>
-        <w:t>ANTICIPATED IC Q&amp;A</w:t>
-      </w:r>
-    </w:p>
-    <w:p>
-      <w:pPr>
-        <w:pStyle w:val="Heading3"/>
-      </w:pPr>
-      <w:r>
-        <w:t>VALUATION</w:t>
+        <w:rPr>
+          <w:sz w:val="20"/>
+        </w:rPr>
+        <w:t>─────────────────────────────────────────────────────────────────</w:t>
       </w:r>
     </w:p>
     <w:p>
       <w:r>
         <w:rPr>
           <w:b/>
+          <w:sz w:val="24"/>
         </w:rPr>
-        <w:t>Q: How did you arrive at 7.8x entry multiple?</w:t>
-      </w:r>
-    </w:p>
-    <w:p>
-      <w:r>
-        <w:t>A: Based on recent PJM CCGT transactions ranging 7.0-8.5x, adjusted down for merchant exposure vs contracted comps. Premium to replacement cost reflects strategic location and grid constraints.</w:t>
+        <w:t>INVESTMENT THESIS (3 Key Points)</w:t>
       </w:r>
     </w:p>
     <w:p>
       <w:r>
         <w:rPr>
-          <w:b/>
+          <w:sz w:val="20"/>
         </w:rPr>
-        <w:t>Q: What's the exit buyer universe?</w:t>
+        <w:t>─────────────────────────────────────────────────────────────────</w:t>
+      </w:r>
+    </w:p>
+    <w:p/>
+    <w:p>
+      <w:r>
+        <w:t>1. ________________________________________________________________</w:t>
       </w:r>
     </w:p>
     <w:p>
       <w:r>
-        <w:t>A: Primary: Utilities seeking gas generation for reliability (AES, NRG, Vistra). Secondary: Infrastructure funds (KKR, Brookfield, GIP) seeking yield with upside. Tertiary: IPPs for portfolio buildout.</w:t>
+        <w:t xml:space="preserve">   Supporting data: ________________________________________________</w:t>
+      </w:r>
+    </w:p>
+    <w:p/>
+    <w:p>
+      <w:r>
+        <w:t>2. ________________________________________________________________</w:t>
+      </w:r>
+    </w:p>
+    <w:p>
+      <w:r>
+        <w:t xml:space="preserve">   Supporting data: ________________________________________________</w:t>
+      </w:r>
+    </w:p>
+    <w:p/>
+    <w:p>
+      <w:r>
+        <w:t>3. ________________________________________________________________</w:t>
+      </w:r>
+    </w:p>
+    <w:p>
+      <w:r>
+        <w:t xml:space="preserve">   Supporting data: ________________________________________________</w:t>
+      </w:r>
+    </w:p>
+    <w:p/>
+    <w:p>
+      <w:r>
+        <w:rPr>
+          <w:sz w:val="20"/>
+        </w:rPr>
+        <w:t>─────────────────────────────────────────────────────────────────</w:t>
+      </w:r>
+    </w:p>
+    <w:p>
+      <w:r>
+        <w:t>KEY RISKS &amp; MITIGANTS</w:t>
       </w:r>
     </w:p>
     <w:p>
       <w:r>
         <w:rPr>
-          <w:b/>
+          <w:sz w:val="20"/>
         </w:rPr>
-        <w:t>Q: Why 7.0x exit multiple vs 7.8x entry?</w:t>
+        <w:t>─────────────────────────────────────────────────────────────────</w:t>
+      </w:r>
+    </w:p>
+    <w:p/>
+    <w:p>
+      <w:r>
+        <w:t>Risk 1: ____________________________________________________________</w:t>
       </w:r>
     </w:p>
     <w:p>
       <w:r>
-        <w:t>A: Conservative assumption reflects shorter remaining life at exit. Sensitivity shows 0.5x multiple change = 200bps IRR impact.</w:t>
+        <w:t xml:space="preserve">  Probability: [ ] High [ ] Med [ ] Low  |  Impact: [ ] High [ ] Med [ ] Low</w:t>
+      </w:r>
+    </w:p>
+    <w:p>
+      <w:r>
+        <w:t xml:space="preserve">  Mitigant: ________________________________________________________</w:t>
       </w:r>
     </w:p>
     <w:p/>
     <w:p>
-      <w:pPr>
-        <w:pStyle w:val="Heading3"/>
-      </w:pPr>
       <w:r>
-        <w:t>FINANCING</w:t>
+        <w:t>Risk 2: ____________________________________________________________</w:t>
+      </w:r>
+    </w:p>
+    <w:p>
+      <w:r>
+        <w:t xml:space="preserve">  Probability: [ ] High [ ] Med [ ] Low  |  Impact: [ ] High [ ] Med [ ] Low</w:t>
+      </w:r>
+    </w:p>
+    <w:p>
+      <w:r>
+        <w:t xml:space="preserve">  Mitigant: ________________________________________________________</w:t>
+      </w:r>
+    </w:p>
+    <w:p/>
+    <w:p>
+      <w:r>
+        <w:t>Risk 3: ____________________________________________________________</w:t>
+      </w:r>
+    </w:p>
+    <w:p>
+      <w:r>
+        <w:t xml:space="preserve">  Probability: [ ] High [ ] Med [ ] Low  |  Impact: [ ] High [ ] Med [ ] Low</w:t>
+      </w:r>
+    </w:p>
+    <w:p>
+      <w:r>
+        <w:t xml:space="preserve">  Mitigant: ________________________________________________________</w:t>
+      </w:r>
+    </w:p>
+    <w:p/>
+    <w:p>
+      <w:r>
+        <w:rPr>
+          <w:sz w:val="20"/>
+        </w:rPr>
+        <w:t>─────────────────────────────────────────────────────────────────</w:t>
+      </w:r>
+    </w:p>
+    <w:p>
+      <w:r>
+        <w:t>SENSITIVITY ANALYSIS</w:t>
       </w:r>
     </w:p>
     <w:p>
       <w:r>
         <w:rPr>
-          <w:b/>
+          <w:sz w:val="20"/>
         </w:rPr>
-        <w:t>Q: Why sweep instead of sculpt?</w:t>
+        <w:t>─────────────────────────────────────────────────────────────────</w:t>
+      </w:r>
+    </w:p>
+    <w:p/>
+    <w:p>
+      <w:r>
+        <w:t>Base Case IRR: ____%</w:t>
+      </w:r>
+    </w:p>
+    <w:p/>
+    <w:p>
+      <w:r>
+        <w:t>Key Sensitivities:</w:t>
       </w:r>
     </w:p>
     <w:p>
       <w:r>
-        <w:t>A: Merchant CFADS volatility makes sculpting impractical – you'd need to re-sculpt every year. Sweep naturally adjusts paydown to actual cash flow.</w:t>
+        <w:t xml:space="preserve">  • Entry EV +5%:           IRR → ____%</w:t>
+      </w:r>
+    </w:p>
+    <w:p>
+      <w:r>
+        <w:t xml:space="preserve">  • Exit Multiple -0.5x:    IRR → ____%</w:t>
+      </w:r>
+    </w:p>
+    <w:p>
+      <w:r>
+        <w:t xml:space="preserve">  • Spark spread -10%:      IRR → ____%</w:t>
+      </w:r>
+    </w:p>
+    <w:p/>
+    <w:p>
+      <w:r>
+        <w:t>Downside Case IRR: ____% (assumptions: ___________________________)</w:t>
+      </w:r>
+    </w:p>
+    <w:p>
+      <w:r>
+        <w:t>Break-even Spark spread: _______________</w:t>
+      </w:r>
+    </w:p>
+    <w:p/>
+    <w:p>
+      <w:r>
+        <w:rPr>
+          <w:sz w:val="20"/>
+        </w:rPr>
+        <w:t>─────────────────────────────────────────────────────────────────</w:t>
+      </w:r>
+    </w:p>
+    <w:p>
+      <w:r>
+        <w:t>DEAL STRUCTURE</w:t>
       </w:r>
     </w:p>
     <w:p>
       <w:r>
         <w:rPr>
-          <w:b/>
+          <w:sz w:val="20"/>
         </w:rPr>
-        <w:t>Q: How did you size the DSRA?</w:t>
+        <w:t>─────────────────────────────────────────────────────────────────</w:t>
+      </w:r>
+    </w:p>
+    <w:p/>
+    <w:p>
+      <w:r>
+        <w:t>SOURCES                          USES</w:t>
       </w:r>
     </w:p>
     <w:p>
       <w:r>
-        <w:t>A: 6-month debt service is market standard for merchant power. Provides 6 months of runway if spark spreads compress or outage occurs.</w:t>
+        <w:t xml:space="preserve">  Debt:      $______mm (___%)      Purchase Price:  $______mm</w:t>
+      </w:r>
+    </w:p>
+    <w:p>
+      <w:r>
+        <w:t xml:space="preserve">  Equity:    $______mm (___%)      Transaction Fees: $______mm</w:t>
+      </w:r>
+    </w:p>
+    <w:p>
+      <w:r>
+        <w:t xml:space="preserve">                                   DSRA Funding:     $______mm</w:t>
       </w:r>
     </w:p>
     <w:p>
       <w:r>
         <w:rPr>
-          <w:b/>
+          <w:sz w:val="20"/>
         </w:rPr>
-        <w:t>Q: What happens if DSCR drops below 1.10x?</w:t>
+        <w:t xml:space="preserve">  ─────────────────────            ─────────────────────</w:t>
       </w:r>
     </w:p>
     <w:p>
       <w:r>
-        <w:t>A: Distributions locked up – all excess cash goes to debt paydown. Likely scenario: temporary commodity dislocation. Recovery expected within 1-2 years.</w:t>
+        <w:t xml:space="preserve">  Total:     $______mm             Total:           $______mm</w:t>
       </w:r>
     </w:p>
     <w:p/>
     <w:p>
-      <w:pPr>
-        <w:pStyle w:val="Heading3"/>
-      </w:pPr>
       <w:r>
-        <w:t>RETURNS</w:t>
+        <w:t>Debt Terms:</w:t>
+      </w:r>
+    </w:p>
+    <w:p>
+      <w:r>
+        <w:t xml:space="preserve">  • Rate: ____% | Tenor: ____ years | Amortization: [ ] Straight [ ] Sweep [ ] Sculpt</w:t>
+      </w:r>
+    </w:p>
+    <w:p>
+      <w:r>
+        <w:t xml:space="preserve">  • DSCR Covenant: ____x | DSRA: ____ months</w:t>
+      </w:r>
+    </w:p>
+    <w:p/>
+    <w:p>
+      <w:r>
+        <w:rPr>
+          <w:sz w:val="20"/>
+        </w:rPr>
+        <w:t>─────────────────────────────────────────────────────────────────</w:t>
+      </w:r>
+    </w:p>
+    <w:p>
+      <w:r>
+        <w:t>DUE DILIGENCE PRIORITIES</w:t>
       </w:r>
     </w:p>
     <w:p>
       <w:r>
         <w:rPr>
-          <w:b/>
+          <w:sz w:val="20"/>
         </w:rPr>
-        <w:t>Q: Walk me through the IRR bridge from unlevered to levered.</w:t>
+        <w:t>─────────────────────────────────────────────────────────────────</w:t>
+      </w:r>
+    </w:p>
+    <w:p/>
+    <w:p>
+      <w:r>
+        <w:t>[ ] Technical: ______________________________________________________</w:t>
       </w:r>
     </w:p>
     <w:p>
       <w:r>
-        <w:t>A: Unlevered 12.1% + leverage benefit (cheaper debt vs equity cost) ≈ +7% – financing costs (interest, fees) ≈ -0.6% = Levered 18.5%. Leverage adds ~6.5% to returns.</w:t>
+        <w:t>[ ] Commercial: _____________________________________________________</w:t>
+      </w:r>
+    </w:p>
+    <w:p>
+      <w:r>
+        <w:t>[ ] Legal/Regulatory: _______________________________________________</w:t>
+      </w:r>
+    </w:p>
+    <w:p>
+      <w:r>
+        <w:t>[ ] Environmental: __________________________________________________</w:t>
+      </w:r>
+    </w:p>
+    <w:p/>
+    <w:p>
+      <w:r>
+        <w:rPr>
+          <w:sz w:val="20"/>
+        </w:rPr>
+        <w:t>─────────────────────────────────────────────────────────────────</w:t>
+      </w:r>
+    </w:p>
+    <w:p>
+      <w:r>
+        <w:t>RECOMMENDATION</w:t>
       </w:r>
     </w:p>
     <w:p>
       <w:r>
         <w:rPr>
-          <w:b/>
+          <w:sz w:val="20"/>
         </w:rPr>
-        <w:t>Q: Why is MOIC 2.15x lower than I'd expect for 18.5% IRR?</w:t>
+        <w:t>─────────────────────────────────────────────────────────────────</w:t>
+      </w:r>
+    </w:p>
+    <w:p/>
+    <w:p>
+      <w:r>
+        <w:t>________________________________________________________________</w:t>
       </w:r>
     </w:p>
     <w:p>
       <w:r>
-        <w:t>A: 7-year hold period. MOIC = cash-on-cash regardless of timing. 18.5% IRR over 7 years compounds to 2.15x.</w:t>
+        <w:t>________________________________________________________________</w:t>
+      </w:r>
+    </w:p>
+    <w:p>
+      <w:r>
+        <w:t>________________________________________________________________</w:t>
+      </w:r>
+    </w:p>
+    <w:p/>
+    <w:p>
+      <w:r>
+        <w:rPr>
+          <w:sz w:val="20"/>
+        </w:rPr>
+        <w:t>═══════════════════════════════════════════════════════════════════</w:t>
+      </w:r>
+    </w:p>
+    <w:p/>
+    <w:p>
+      <w:r>
+        <w:rPr>
+          <w:sz w:val="20"/>
+        </w:rPr>
+        <w:t>─────────────────────────────────────────────────────────────────</w:t>
+      </w:r>
+    </w:p>
+    <w:p>
+      <w:r>
+        <w:t>THERMAL-SPECIFIC CONSIDERATIONS</w:t>
       </w:r>
     </w:p>
     <w:p>
       <w:r>
         <w:rPr>
-          <w:b/>
+          <w:sz w:val="20"/>
         </w:rPr>
-        <w:t>Q: What's the downside scenario?</w:t>
-      </w:r>
-    </w:p>
-    <w:p>
-      <w:r>
-        <w:t>A: Gas +25%, power flat = squeezed spark spreads. IRR drops to 14.2%, still above hurdle. DSCR 1.28x maintains covenant compliance.</w:t>
-      </w:r>
-    </w:p>
-    <w:p/>
-    <w:p>
-      <w:pPr>
-        <w:pStyle w:val="Heading3"/>
-      </w:pPr>
-      <w:r>
-        <w:t>MARKET</w:t>
-      </w:r>
-    </w:p>
-    <w:p>
-      <w:r>
-        <w:rPr>
-          <w:b/>
-        </w:rPr>
-        <w:t>Q: What happens if PJM capacity prices collapse?</w:t>
-      </w:r>
-    </w:p>
-    <w:p>
-      <w:r>
-        <w:t>A: Downside scenario assumes 20% capacity price decline. Still economic due to energy revenue diversification. Extreme downside: asset becomes peaker-like, relies on scarcity pricing.</w:t>
-      </w:r>
-    </w:p>
-    <w:p>
-      <w:r>
-        <w:rPr>
-          <w:b/>
-        </w:rPr>
-        <w:t>Q: How does carbon regulation affect the investment?</w:t>
-      </w:r>
-    </w:p>
-    <w:p>
-      <w:r>
-        <w:t>A: Gas is bridge fuel – CCGTs run when renewables can't. Carbon cost would increase power prices, potentially improving spark spreads. Natural gas is 50% lower emissions than coal.</w:t>
-      </w:r>
-    </w:p>
-    <w:p/>
-    <w:p>
-      <w:pPr>
-        <w:pStyle w:val="Heading3"/>
-      </w:pPr>
-      <w:r>
-        <w:t>OPERATIONS</w:t>
-      </w:r>
-    </w:p>
-    <w:p>
-      <w:r>
-        <w:rPr>
-          <w:b/>
-        </w:rPr>
-        <w:t>Q: What are the key operational risks?</w:t>
-      </w:r>
-    </w:p>
-    <w:p>
-      <w:r>
-        <w:t>A: Equipment failure (mitigated by LTSA), fuel supply disruption (mitigated by pipeline redundancy), grid curtailment (mitigated by must-run status).</w:t>
-      </w:r>
-    </w:p>
-    <w:p>
-      <w:r>
-        <w:rPr>
-          <w:b/>
-        </w:rPr>
-        <w:t>Q: What value creation levers exist?</w:t>
-      </w:r>
-    </w:p>
-    <w:p>
-      <w:r>
-        <w:t>A: 1) Heat rate improvement project (+$2mm EBITDA), 2) Ancillary services expansion, 3) Capacity factor optimization through better dispatch strategy.</w:t>
+        <w:t>─────────────────────────────────────────────────────────────────</w:t>
       </w:r>
     </w:p>
     <w:p/>
     <w:p>
       <w:r>
-        <w:t>────────────────────────────────────────────────────────────</w:t>
-      </w:r>
-    </w:p>
-    <w:p>
-      <w:pPr>
-        <w:pStyle w:val="Heading2"/>
-      </w:pPr>
-      <w:r>
-        <w:t>DILIGENCE PLAN</w:t>
-      </w:r>
-    </w:p>
-    <w:p>
-      <w:pPr>
-        <w:pStyle w:val="Heading3"/>
-      </w:pPr>
-      <w:r>
-        <w:t>Technical:</w:t>
+        <w:t>[ ] Spark spread: Current $____/MWh, Break-even $____/MWh</w:t>
       </w:r>
     </w:p>
     <w:p>
       <w:r>
-        <w:t>☐ Independent engineer report (Wood Mackenzie)</w:t>
+        <w:t>[ ] Heat rate: Plant ____ Btu/kWh vs Market HR ____ Btu/kWh</w:t>
       </w:r>
     </w:p>
     <w:p>
       <w:r>
-        <w:t>☐ Equipment condition assessment – turbine hours remaining</w:t>
+        <w:t>[ ] Capacity factor: ____% (basis: ________________)</w:t>
       </w:r>
     </w:p>
     <w:p>
       <w:r>
-        <w:t>☐ Environmental compliance review – air permits, water discharge</w:t>
+        <w:t>[ ] Gas basis risk: Hub + $____ basis differential</w:t>
       </w:r>
     </w:p>
     <w:p>
       <w:r>
-        <w:t>☐ Grid interconnection study – transmission constraints</w:t>
-      </w:r>
-    </w:p>
-    <w:p>
-      <w:pPr>
-        <w:pStyle w:val="Heading3"/>
-      </w:pPr>
-      <w:r>
-        <w:t>Commercial:</w:t>
+        <w:t>[ ] Environmental: Carbon exposure? [ ] Y [ ] N  If Y: $____/MWh impact</w:t>
       </w:r>
     </w:p>
     <w:p>
       <w:r>
-        <w:t>☐ PPA/hedging contract review</w:t>
+        <w:t>[ ] Capacity market: ____ $/kW-yr locked through ____</w:t>
       </w:r>
     </w:p>
-    <w:p>
-      <w:r>
-        <w:t>☐ Market study validation (ERCOT/PJM consultant)</w:t>
-      </w:r>
-    </w:p>
-    <w:p>
-      <w:r>
-        <w:t>☐ Fuel supply and transportation agreements</w:t>
-      </w:r>
-    </w:p>
-    <w:p>
-      <w:r>
-        <w:t>☐ Counterparty credit analysis</w:t>
-      </w:r>
-    </w:p>
-    <w:p>
-      <w:pPr>
-        <w:pStyle w:val="Heading3"/>
-      </w:pPr>
-      <w:r>
-        <w:t>Legal:</w:t>
-      </w:r>
-    </w:p>
-    <w:p>
-      <w:r>
-        <w:t>☐ Title and land rights review</w:t>
-      </w:r>
-    </w:p>
-    <w:p>
-      <w:r>
-        <w:t>☐ Permitting status and renewal timeline</w:t>
-      </w:r>
-    </w:p>
-    <w:p>
-      <w:r>
-        <w:t>☐ Environmental liability assessment</w:t>
-      </w:r>
-    </w:p>
-    <w:p>
-      <w:r>
-        <w:t>☐ Regulatory status and rate case history</w:t>
-      </w:r>
-    </w:p>
-    <w:p>
-      <w:pPr>
-        <w:pStyle w:val="Heading3"/>
-      </w:pPr>
-      <w:r>
-        <w:t>Financial:</w:t>
-      </w:r>
-    </w:p>
-    <w:p>
-      <w:r>
-        <w:t>☐ Quality of earnings (trailing 3-year analysis)</w:t>
-      </w:r>
-    </w:p>
-    <w:p>
-      <w:r>
-        <w:t>☐ Working capital normalization</w:t>
-      </w:r>
-    </w:p>
-    <w:p>
-      <w:r>
-        <w:t>☐ Tax structure optimization</w:t>
-      </w:r>
-    </w:p>
-    <w:p>
-      <w:r>
-        <w:t>☐ Insurance adequacy review</w:t>
-      </w:r>
-    </w:p>
+    <w:p/>
+    <w:p/>
     <w:sectPr>
       <w:pgSz w:w="12240" w:h="15840"/>
       <w:pgMar w:top="1440" w:right="1800" w:bottom="1440" w:left="1800" w:header="720" w:footer="720" w:gutter="0"/>

</xml_diff>